<commit_message>
Update spring simulations 05 and 06: load & unload checkpoint
</commit_message>
<xml_diff>
--- a/05-spring-force/worksheet.docx
+++ b/05-spring-force/worksheet.docx
@@ -168,7 +168,7 @@
               <w:rPr>
                 <w:sz w:val="20"/>
               </w:rPr>
-              <w:t xml:space="preserve"> tab has the same three parts as this sheet; write your </w:t>
+              <w:t xml:space="preserve"> tab has the same four parts as this sheet; write your </w:t>
             </w:r>
             <w:r>
               <w:rPr>
@@ -225,7 +225,16 @@
               <w:rPr>
                 <w:sz w:val="20"/>
               </w:rPr>
-              <w:t xml:space="preserve"> homework (≈ 30 min).</w:t>
+              <w:t xml:space="preserve"> homework (≈ 30 min) · </w:t>
+            </w:r>
+            <w:r>
+              <w:rPr>
+                <w:b/>
+              </w:rPr>
+              <w:t>Part 4</w:t>
+            </w:r>
+            <w:r>
+              <w:t xml:space="preserve"> checkpoint: hysteresis and the elastic limit (≈ 15 min).</w:t>
             </w:r>
           </w:p>
           <w:p>
@@ -2397,6 +2406,805 @@
         <w:spacing w:after="40"/>
       </w:pPr>
     </w:p>
+    <w:p>
+      <w:r>
+        <w:br w:type="page"/>
+      </w:r>
+    </w:p>
+    <w:p>
+      <w:pPr>
+        <w:pStyle w:val="Heading1"/>
+      </w:pPr>
+      <w:r>
+        <w:t>Part 4 — Checkpoint: hysteresis and the elastic limit</w:t>
+      </w:r>
+    </w:p>
+    <w:p>
+      <w:r>
+        <w:t xml:space="preserve">Simulation: mode </w:t>
+      </w:r>
+      <w:r>
+        <w:rPr>
+          <w:b/>
+        </w:rPr>
+        <w:t>Load &amp; unload</w:t>
+      </w:r>
+      <w:r>
+        <w:t>. Spring: Investigation spring (</w:t>
+      </w:r>
+      <w:r>
+        <w:rPr>
+          <w:i/>
+        </w:rPr>
+        <w:t>k</w:t>
+      </w:r>
+      <w:r>
+        <w:t xml:space="preserve"> = 25.0 N m</w:t>
+      </w:r>
+      <w:r>
+        <w:rPr>
+          <w:vertAlign w:val="superscript"/>
+        </w:rPr>
+        <w:t>−1</w:t>
+      </w:r>
+      <w:r>
+        <w:t xml:space="preserve">, elastic limit </w:t>
+      </w:r>
+      <w:r>
+        <w:rPr>
+          <w:b/>
+        </w:rPr>
+        <w:t>E</w:t>
+      </w:r>
+      <w:r>
+        <w:t xml:space="preserve"> at 6.0 N). Load it in steps up to 800 g, then unload. Record the extension readout (pointer − 30.0 cm) </w:t>
+      </w:r>
+      <w:r>
+        <w:rPr>
+          <w:i/>
+        </w:rPr>
+        <w:t>x</w:t>
+      </w:r>
+      <w:r>
+        <w:t xml:space="preserve"> each time the load is at rest.</w:t>
+      </w:r>
+    </w:p>
+    <w:tbl>
+      <w:tblPr>
+        <w:tblStyle w:val="TableGrid"/>
+        <w:tblW w:type="auto" w:w="0"/>
+        <w:jc w:val="center"/>
+        <w:tblLayout w:type="fixed"/>
+        <w:tblLook w:firstColumn="1" w:firstRow="1" w:lastColumn="0" w:lastRow="0" w:noHBand="0" w:noVBand="1" w:val="04A0"/>
+        <w:tblLayout w:type="fixed"/>
+      </w:tblPr>
+      <w:tblGrid>
+        <w:gridCol w:w="2409"/>
+        <w:gridCol w:w="2409"/>
+        <w:gridCol w:w="2409"/>
+        <w:gridCol w:w="2409"/>
+      </w:tblGrid>
+      <w:tr>
+        <w:trPr>
+          <w:trHeight w:val="454"/>
+          <w:cantSplit/>
+        </w:trPr>
+        <w:tc>
+          <w:tcPr>
+            <w:tcW w:type="dxa" w:w="1701"/>
+            <w:shd w:val="clear" w:color="auto" w:fill="1F3A5F"/>
+          </w:tcPr>
+          <w:p>
+            <w:pPr>
+              <w:jc w:val="center"/>
+            </w:pPr>
+            <w:r>
+              <w:rPr>
+                <w:b/>
+                <w:color w:val="FFFFFF"/>
+                <w:sz w:val="20"/>
+              </w:rPr>
+              <w:t xml:space="preserve">mass </w:t>
+            </w:r>
+            <w:r>
+              <w:rPr>
+                <w:b/>
+                <w:i/>
+                <w:color w:val="FFFFFF"/>
+                <w:sz w:val="20"/>
+              </w:rPr>
+              <w:t>m</w:t>
+            </w:r>
+            <w:r>
+              <w:rPr>
+                <w:b/>
+                <w:color w:val="FFFFFF"/>
+                <w:sz w:val="20"/>
+              </w:rPr>
+              <w:t xml:space="preserve"> / g</w:t>
+            </w:r>
+          </w:p>
+        </w:tc>
+        <w:tc>
+          <w:tcPr>
+            <w:tcW w:type="dxa" w:w="2041"/>
+            <w:shd w:val="clear" w:color="auto" w:fill="1F3A5F"/>
+          </w:tcPr>
+          <w:p>
+            <w:pPr>
+              <w:jc w:val="center"/>
+            </w:pPr>
+            <w:r>
+              <w:rPr>
+                <w:b/>
+                <w:color w:val="FFFFFF"/>
+                <w:sz w:val="20"/>
+              </w:rPr>
+              <w:t xml:space="preserve">load </w:t>
+            </w:r>
+            <w:r>
+              <w:rPr>
+                <w:b/>
+                <w:i/>
+                <w:color w:val="FFFFFF"/>
+                <w:sz w:val="20"/>
+              </w:rPr>
+              <w:t>F</w:t>
+            </w:r>
+            <w:r>
+              <w:rPr>
+                <w:b/>
+                <w:color w:val="FFFFFF"/>
+                <w:sz w:val="20"/>
+              </w:rPr>
+              <w:t xml:space="preserve"> = </w:t>
+            </w:r>
+            <w:r>
+              <w:rPr>
+                <w:b/>
+                <w:i/>
+                <w:color w:val="FFFFFF"/>
+                <w:sz w:val="20"/>
+              </w:rPr>
+              <w:t>mg</w:t>
+            </w:r>
+            <w:r>
+              <w:rPr>
+                <w:b/>
+                <w:color w:val="FFFFFF"/>
+                <w:sz w:val="20"/>
+              </w:rPr>
+              <w:t xml:space="preserve"> / N</w:t>
+            </w:r>
+          </w:p>
+        </w:tc>
+        <w:tc>
+          <w:tcPr>
+            <w:tcW w:type="dxa" w:w="2041"/>
+            <w:shd w:val="clear" w:color="auto" w:fill="1F3A5F"/>
+          </w:tcPr>
+          <w:p>
+            <w:pPr>
+              <w:jc w:val="center"/>
+            </w:pPr>
+            <w:r>
+              <w:rPr>
+                <w:b/>
+                <w:color w:val="FFFFFF"/>
+                <w:sz w:val="20"/>
+              </w:rPr>
+              <w:t xml:space="preserve">loading: </w:t>
+            </w:r>
+            <w:r>
+              <w:rPr>
+                <w:b/>
+                <w:i/>
+                <w:color w:val="FFFFFF"/>
+                <w:sz w:val="20"/>
+              </w:rPr>
+              <w:t>x</w:t>
+            </w:r>
+            <w:r>
+              <w:rPr>
+                <w:b/>
+                <w:color w:val="FFFFFF"/>
+                <w:sz w:val="20"/>
+              </w:rPr>
+              <w:t xml:space="preserve"> / cm</w:t>
+            </w:r>
+          </w:p>
+        </w:tc>
+        <w:tc>
+          <w:tcPr>
+            <w:tcW w:type="dxa" w:w="2041"/>
+            <w:shd w:val="clear" w:color="auto" w:fill="1F3A5F"/>
+          </w:tcPr>
+          <w:p>
+            <w:pPr>
+              <w:jc w:val="center"/>
+            </w:pPr>
+            <w:r>
+              <w:rPr>
+                <w:b/>
+                <w:color w:val="FFFFFF"/>
+                <w:sz w:val="20"/>
+              </w:rPr>
+              <w:t xml:space="preserve">unloading: </w:t>
+            </w:r>
+            <w:r>
+              <w:rPr>
+                <w:b/>
+                <w:i/>
+                <w:color w:val="FFFFFF"/>
+                <w:sz w:val="20"/>
+              </w:rPr>
+              <w:t>x</w:t>
+            </w:r>
+            <w:r>
+              <w:rPr>
+                <w:b/>
+                <w:color w:val="FFFFFF"/>
+                <w:sz w:val="20"/>
+              </w:rPr>
+              <w:t xml:space="preserve"> / cm</w:t>
+            </w:r>
+          </w:p>
+        </w:tc>
+      </w:tr>
+      <w:tr>
+        <w:trPr>
+          <w:trHeight w:val="454"/>
+          <w:cantSplit/>
+        </w:trPr>
+        <w:tc>
+          <w:tcPr>
+            <w:tcW w:type="dxa" w:w="1701"/>
+          </w:tcPr>
+          <w:p>
+            <w:pPr>
+              <w:jc w:val="center"/>
+            </w:pPr>
+            <w:r>
+              <w:rPr>
+                <w:sz w:val="20"/>
+              </w:rPr>
+              <w:t>0</w:t>
+            </w:r>
+          </w:p>
+        </w:tc>
+        <w:tc>
+          <w:tcPr>
+            <w:tcW w:type="dxa" w:w="2041"/>
+          </w:tcPr>
+          <w:p>
+            <w:pPr>
+              <w:jc w:val="center"/>
+            </w:pPr>
+          </w:p>
+        </w:tc>
+        <w:tc>
+          <w:tcPr>
+            <w:tcW w:type="dxa" w:w="2041"/>
+          </w:tcPr>
+          <w:p>
+            <w:pPr>
+              <w:jc w:val="center"/>
+            </w:pPr>
+          </w:p>
+        </w:tc>
+        <w:tc>
+          <w:tcPr>
+            <w:tcW w:type="dxa" w:w="2041"/>
+          </w:tcPr>
+          <w:p>
+            <w:pPr>
+              <w:jc w:val="center"/>
+            </w:pPr>
+          </w:p>
+        </w:tc>
+      </w:tr>
+      <w:tr>
+        <w:trPr>
+          <w:trHeight w:val="454"/>
+          <w:cantSplit/>
+        </w:trPr>
+        <w:tc>
+          <w:tcPr>
+            <w:tcW w:type="dxa" w:w="1701"/>
+          </w:tcPr>
+          <w:p>
+            <w:pPr>
+              <w:jc w:val="center"/>
+            </w:pPr>
+            <w:r>
+              <w:rPr>
+                <w:sz w:val="20"/>
+              </w:rPr>
+              <w:t>200</w:t>
+            </w:r>
+          </w:p>
+        </w:tc>
+        <w:tc>
+          <w:tcPr>
+            <w:tcW w:type="dxa" w:w="2041"/>
+          </w:tcPr>
+          <w:p>
+            <w:pPr>
+              <w:jc w:val="center"/>
+            </w:pPr>
+          </w:p>
+        </w:tc>
+        <w:tc>
+          <w:tcPr>
+            <w:tcW w:type="dxa" w:w="2041"/>
+          </w:tcPr>
+          <w:p>
+            <w:pPr>
+              <w:jc w:val="center"/>
+            </w:pPr>
+          </w:p>
+        </w:tc>
+        <w:tc>
+          <w:tcPr>
+            <w:tcW w:type="dxa" w:w="2041"/>
+          </w:tcPr>
+          <w:p>
+            <w:pPr>
+              <w:jc w:val="center"/>
+            </w:pPr>
+          </w:p>
+        </w:tc>
+      </w:tr>
+      <w:tr>
+        <w:trPr>
+          <w:trHeight w:val="454"/>
+          <w:cantSplit/>
+        </w:trPr>
+        <w:tc>
+          <w:tcPr>
+            <w:tcW w:type="dxa" w:w="1701"/>
+          </w:tcPr>
+          <w:p>
+            <w:pPr>
+              <w:jc w:val="center"/>
+            </w:pPr>
+            <w:r>
+              <w:rPr>
+                <w:sz w:val="20"/>
+              </w:rPr>
+              <w:t>400</w:t>
+            </w:r>
+          </w:p>
+        </w:tc>
+        <w:tc>
+          <w:tcPr>
+            <w:tcW w:type="dxa" w:w="2041"/>
+          </w:tcPr>
+          <w:p>
+            <w:pPr>
+              <w:jc w:val="center"/>
+            </w:pPr>
+          </w:p>
+        </w:tc>
+        <w:tc>
+          <w:tcPr>
+            <w:tcW w:type="dxa" w:w="2041"/>
+          </w:tcPr>
+          <w:p>
+            <w:pPr>
+              <w:jc w:val="center"/>
+            </w:pPr>
+          </w:p>
+        </w:tc>
+        <w:tc>
+          <w:tcPr>
+            <w:tcW w:type="dxa" w:w="2041"/>
+          </w:tcPr>
+          <w:p>
+            <w:pPr>
+              <w:jc w:val="center"/>
+            </w:pPr>
+          </w:p>
+        </w:tc>
+      </w:tr>
+      <w:tr>
+        <w:trPr>
+          <w:trHeight w:val="454"/>
+          <w:cantSplit/>
+        </w:trPr>
+        <w:tc>
+          <w:tcPr>
+            <w:tcW w:type="dxa" w:w="1701"/>
+          </w:tcPr>
+          <w:p>
+            <w:pPr>
+              <w:jc w:val="center"/>
+            </w:pPr>
+            <w:r>
+              <w:rPr>
+                <w:sz w:val="20"/>
+              </w:rPr>
+              <w:t>600</w:t>
+            </w:r>
+          </w:p>
+        </w:tc>
+        <w:tc>
+          <w:tcPr>
+            <w:tcW w:type="dxa" w:w="2041"/>
+          </w:tcPr>
+          <w:p>
+            <w:pPr>
+              <w:jc w:val="center"/>
+            </w:pPr>
+          </w:p>
+        </w:tc>
+        <w:tc>
+          <w:tcPr>
+            <w:tcW w:type="dxa" w:w="2041"/>
+          </w:tcPr>
+          <w:p>
+            <w:pPr>
+              <w:jc w:val="center"/>
+            </w:pPr>
+          </w:p>
+        </w:tc>
+        <w:tc>
+          <w:tcPr>
+            <w:tcW w:type="dxa" w:w="2041"/>
+          </w:tcPr>
+          <w:p>
+            <w:pPr>
+              <w:jc w:val="center"/>
+            </w:pPr>
+          </w:p>
+        </w:tc>
+      </w:tr>
+      <w:tr>
+        <w:trPr>
+          <w:trHeight w:val="454"/>
+          <w:cantSplit/>
+        </w:trPr>
+        <w:tc>
+          <w:tcPr>
+            <w:tcW w:type="dxa" w:w="1701"/>
+          </w:tcPr>
+          <w:p>
+            <w:pPr>
+              <w:jc w:val="center"/>
+            </w:pPr>
+            <w:r>
+              <w:rPr>
+                <w:sz w:val="20"/>
+              </w:rPr>
+              <w:t>700</w:t>
+            </w:r>
+          </w:p>
+        </w:tc>
+        <w:tc>
+          <w:tcPr>
+            <w:tcW w:type="dxa" w:w="2041"/>
+          </w:tcPr>
+          <w:p>
+            <w:pPr>
+              <w:jc w:val="center"/>
+            </w:pPr>
+          </w:p>
+        </w:tc>
+        <w:tc>
+          <w:tcPr>
+            <w:tcW w:type="dxa" w:w="2041"/>
+          </w:tcPr>
+          <w:p>
+            <w:pPr>
+              <w:jc w:val="center"/>
+            </w:pPr>
+          </w:p>
+        </w:tc>
+        <w:tc>
+          <w:tcPr>
+            <w:tcW w:type="dxa" w:w="2041"/>
+          </w:tcPr>
+          <w:p>
+            <w:pPr>
+              <w:jc w:val="center"/>
+            </w:pPr>
+          </w:p>
+        </w:tc>
+      </w:tr>
+      <w:tr>
+        <w:trPr>
+          <w:trHeight w:val="454"/>
+          <w:cantSplit/>
+        </w:trPr>
+        <w:tc>
+          <w:tcPr>
+            <w:tcW w:type="dxa" w:w="1701"/>
+          </w:tcPr>
+          <w:p>
+            <w:pPr>
+              <w:jc w:val="center"/>
+            </w:pPr>
+            <w:r>
+              <w:rPr>
+                <w:sz w:val="20"/>
+              </w:rPr>
+              <w:t>800</w:t>
+            </w:r>
+          </w:p>
+        </w:tc>
+        <w:tc>
+          <w:tcPr>
+            <w:tcW w:type="dxa" w:w="2041"/>
+          </w:tcPr>
+          <w:p>
+            <w:pPr>
+              <w:jc w:val="center"/>
+            </w:pPr>
+          </w:p>
+        </w:tc>
+        <w:tc>
+          <w:tcPr>
+            <w:tcW w:type="dxa" w:w="2041"/>
+          </w:tcPr>
+          <w:p>
+            <w:pPr>
+              <w:jc w:val="center"/>
+            </w:pPr>
+          </w:p>
+        </w:tc>
+        <w:tc>
+          <w:tcPr>
+            <w:tcW w:type="dxa" w:w="2041"/>
+            <w:shd w:val="clear" w:color="auto" w:fill="ECEFF1"/>
+          </w:tcPr>
+          <w:p>
+            <w:pPr>
+              <w:jc w:val="center"/>
+            </w:pPr>
+            <w:r>
+              <w:rPr>
+                <w:color w:val="606060"/>
+                <w:sz w:val="18"/>
+              </w:rPr>
+              <w:t>(turning point)</w:t>
+            </w:r>
+          </w:p>
+        </w:tc>
+      </w:tr>
+    </w:tbl>
+    <w:p/>
+    <w:p>
+      <w:pPr>
+        <w:keepNext/>
+      </w:pPr>
+      <w:r>
+        <w:rPr>
+          <w:b/>
+        </w:rPr>
+        <w:t>15.</w:t>
+      </w:r>
+      <w:r>
+        <w:t xml:space="preserve"> Plot the loading points and the unloading points on the grid and join each set. Mark the elastic limit </w:t>
+      </w:r>
+      <w:r>
+        <w:rPr>
+          <w:b/>
+        </w:rPr>
+        <w:t>E</w:t>
+      </w:r>
+      <w:r>
+        <w:t xml:space="preserve"> and label the loading and unloading lines with arrows.</w:t>
+      </w:r>
+    </w:p>
+    <w:p>
+      <w:pPr>
+        <w:jc w:val="center"/>
+      </w:pPr>
+      <w:r>
+        <w:drawing>
+          <wp:inline xmlns:a="http://schemas.openxmlformats.org/drawingml/2006/main" xmlns:pic="http://schemas.openxmlformats.org/drawingml/2006/picture">
+            <wp:extent cx="5220000" cy="3367742"/>
+            <wp:docPr id="4" name="Picture 4"/>
+            <wp:cNvGraphicFramePr>
+              <a:graphicFrameLocks noChangeAspect="1"/>
+            </wp:cNvGraphicFramePr>
+            <a:graphic>
+              <a:graphicData uri="http://schemas.openxmlformats.org/drawingml/2006/picture">
+                <pic:pic>
+                  <pic:nvPicPr>
+                    <pic:cNvPr id="0" name="blank_loop_grid.png"/>
+                    <pic:cNvPicPr/>
+                  </pic:nvPicPr>
+                  <pic:blipFill>
+                    <a:blip r:embed="rId14"/>
+                    <a:stretch>
+                      <a:fillRect/>
+                    </a:stretch>
+                  </pic:blipFill>
+                  <pic:spPr>
+                    <a:xfrm>
+                      <a:off x="0" y="0"/>
+                      <a:ext cx="5220000" cy="3367742"/>
+                    </a:xfrm>
+                    <a:prstGeom prst="rect"/>
+                  </pic:spPr>
+                </pic:pic>
+              </a:graphicData>
+            </a:graphic>
+          </wp:inline>
+        </w:drawing>
+      </w:r>
+    </w:p>
+    <w:p>
+      <w:pPr>
+        <w:keepNext/>
+      </w:pPr>
+      <w:r>
+        <w:rPr>
+          <w:b/>
+        </w:rPr>
+        <w:t>16.</w:t>
+      </w:r>
+      <w:r>
+        <w:t xml:space="preserve"> Read the </w:t>
+      </w:r>
+      <w:r>
+        <w:rPr>
+          <w:b/>
+        </w:rPr>
+        <w:t>permanent extension</w:t>
+      </w:r>
+      <w:r>
+        <w:t xml:space="preserve"> from your graph: __________ cm. Explain why the unloading line does not go back through the origin.</w:t>
+      </w:r>
+    </w:p>
+    <w:p>
+      <w:pPr>
+        <w:spacing w:after="120"/>
+      </w:pPr>
+      <w:r>
+        <w:rPr>
+          <w:color w:val="BBBBBB"/>
+        </w:rPr>
+        <w:t>______________________________________________________________________________________</w:t>
+      </w:r>
+    </w:p>
+    <w:p>
+      <w:pPr>
+        <w:spacing w:after="120"/>
+      </w:pPr>
+      <w:r>
+        <w:rPr>
+          <w:color w:val="BBBBBB"/>
+        </w:rPr>
+        <w:t>______________________________________________________________________________________</w:t>
+      </w:r>
+    </w:p>
+    <w:p>
+      <w:pPr>
+        <w:keepNext/>
+      </w:pPr>
+      <w:r>
+        <w:rPr>
+          <w:b/>
+        </w:rPr>
+        <w:t>17.</w:t>
+      </w:r>
+      <w:r>
+        <w:t xml:space="preserve"> Spring: Rubber band. Load it to 500 g in 50 g steps, then unload to 0 g. Sketch the loop (no numbers needed). Use arrows for loading and unloading and </w:t>
+      </w:r>
+      <w:r>
+        <w:rPr>
+          <w:b/>
+        </w:rPr>
+        <w:t>shade the area that equals the energy turned into heat</w:t>
+      </w:r>
+      <w:r>
+        <w:t>.</w:t>
+      </w:r>
+    </w:p>
+    <w:tbl>
+      <w:tblPr>
+        <w:tblStyle w:val="TableGrid"/>
+        <w:tblW w:type="auto" w:w="0"/>
+        <w:tblLook w:firstColumn="1" w:firstRow="1" w:lastColumn="0" w:lastRow="0" w:noHBand="0" w:noVBand="1" w:val="04A0"/>
+      </w:tblPr>
+      <w:tblGrid>
+        <w:gridCol w:w="9638"/>
+      </w:tblGrid>
+      <w:tr>
+        <w:trPr>
+          <w:trHeight w:val="2400"/>
+          <w:cantSplit/>
+        </w:trPr>
+        <w:tc>
+          <w:tcPr>
+            <w:tcW w:type="dxa" w:w="9638"/>
+          </w:tcPr>
+          <w:p>
+            <w:r>
+              <w:rPr>
+                <w:color w:val="606060"/>
+                <w:sz w:val="18"/>
+              </w:rPr>
+              <w:t>Sketch</w:t>
+            </w:r>
+          </w:p>
+        </w:tc>
+      </w:tr>
+    </w:tbl>
+    <w:p/>
+    <w:p>
+      <w:pPr>
+        <w:keepNext/>
+      </w:pPr>
+      <w:r>
+        <w:rPr>
+          <w:b/>
+        </w:rPr>
+        <w:t>18.</w:t>
+      </w:r>
+      <w:r>
+        <w:t xml:space="preserve"> From the readouts after the full cycle: energy stored = __________ J, energy given back = __________ J, so energy → heat = __________ J = __________ % of the energy stored.</w:t>
+      </w:r>
+    </w:p>
+    <w:p/>
+    <w:p>
+      <w:pPr>
+        <w:keepNext/>
+      </w:pPr>
+      <w:r>
+        <w:rPr>
+          <w:b/>
+        </w:rPr>
+        <w:t>19.</w:t>
+      </w:r>
+      <w:r>
+        <w:t xml:space="preserve"> This is called </w:t>
+      </w:r>
+      <w:r>
+        <w:rPr>
+          <w:b/>
+        </w:rPr>
+        <w:t>hysteresis</w:t>
+      </w:r>
+      <w:r>
+        <w:t>. Explain why a rubber band that is stretched and released many times gets warm. Would you choose a material with a large or a small loop for the rubber mounts that stop a washing machine shaking? Why?</w:t>
+      </w:r>
+    </w:p>
+    <w:p>
+      <w:pPr>
+        <w:spacing w:after="120"/>
+      </w:pPr>
+      <w:r>
+        <w:rPr>
+          <w:color w:val="BBBBBB"/>
+        </w:rPr>
+        <w:t>______________________________________________________________________________________</w:t>
+      </w:r>
+    </w:p>
+    <w:p>
+      <w:pPr>
+        <w:spacing w:after="120"/>
+      </w:pPr>
+      <w:r>
+        <w:rPr>
+          <w:color w:val="BBBBBB"/>
+        </w:rPr>
+        <w:t>______________________________________________________________________________________</w:t>
+      </w:r>
+    </w:p>
+    <w:p>
+      <w:pPr>
+        <w:spacing w:after="120"/>
+      </w:pPr>
+      <w:r>
+        <w:rPr>
+          <w:color w:val="BBBBBB"/>
+        </w:rPr>
+        <w:t>______________________________________________________________________________________</w:t>
+      </w:r>
+    </w:p>
     <w:sectPr>
       <w:headerReference w:type="default" r:id="rId9"/>
       <w:footerReference w:type="default" r:id="rId10"/>

</xml_diff>